<commit_message>
Actualiza documentos 01, 02, 04 y 05 con ajustes de coordinacion BBDD: nivel sucursales, Historia 009 (temperatura PT100) y Modelo E-R con 11 tablas
</commit_message>
<xml_diff>
--- a/docs/Fase 2/Evidencias Proyecto (Version Agil)/Documento 01 - Product Vision.docx
+++ b/docs/Fase 2/Evidencias Proyecto (Version Agil)/Documento 01 - Product Vision.docx
@@ -31,7 +31,7 @@
             <w:tblLook w:val="04A0" w:firstRow="1" w:lastRow="0" w:firstColumn="1" w:lastColumn="0" w:noHBand="0" w:noVBand="1"/>
           </w:tblPr>
           <w:tblGrid>
-            <w:gridCol w:w="8838"/>
+            <w:gridCol w:w="9054"/>
           </w:tblGrid>
           <w:tr>
             <w:trPr>
@@ -268,13 +268,12 @@
                   <w:rFonts w:cstheme="minorHAnsi"/>
                   <w:b/>
                   <w:bCs/>
-                  <w:color w:val="FF0000"/>
                 </w:rPr>
                 <w:alias w:val="Fecha"/>
                 <w:id w:val="516659546"/>
+                <w:showingPlcHdr/>
                 <w:dataBinding w:prefixMappings="xmlns:ns0='http://schemas.microsoft.com/office/2006/coverPageProps'" w:xpath="/ns0:CoverPageProperties[1]/ns0:PublishDate[1]" w:storeItemID="{55AF091B-3C7A-41E3-B477-F2FDAA23CFDA}"/>
                 <w:date>
-                  <w:dateFormat w:val="dd/MM/yyyy"/>
                   <w:lid w:val="es-ES"/>
                   <w:storeMappedDataAs w:val="dateTime"/>
                   <w:calendar w:val="gregorian"/>
@@ -301,9 +300,8 @@
                         <w:rFonts w:cstheme="minorHAnsi"/>
                         <w:b/>
                         <w:bCs/>
-                        <w:color w:val="FF0000"/>
                       </w:rPr>
-                      <w:t>[Seleccionar fecha]</w:t>
+                      <w:t xml:space="preserve">     </w:t>
                     </w:r>
                   </w:p>
                 </w:tc>
@@ -334,7 +332,7 @@
             <w:tblLook w:val="04A0" w:firstRow="1" w:lastRow="0" w:firstColumn="1" w:lastColumn="0" w:noHBand="0" w:noVBand="1"/>
           </w:tblPr>
           <w:tblGrid>
-            <w:gridCol w:w="8838"/>
+            <w:gridCol w:w="9054"/>
           </w:tblGrid>
           <w:tr>
             <w:sdt>
@@ -2543,6 +2541,20 @@
           <w:lang w:val="es-ES" w:eastAsia="es-ES"/>
         </w:rPr>
       </w:pPr>
+      <w:r>
+        <w:rPr>
+          <w:lang w:val="es-ES" w:eastAsia="es-ES"/>
+        </w:rPr>
+        <w:lastRenderedPageBreak/>
+        <w:t>Un cliente final puede operar más de una ubicación o sucursal (por ejemplo, distintas tiendas o instalaciones repartidas geográficamente). ElectroMap permite que el cliente visualice el estado de todas sus sucursales y tableros asociados desde una misma cuenta, sin perder la separación de acceso frente a otros clientes de la misma empresa.</w:t>
+      </w:r>
+    </w:p>
+    <w:p>
+      <w:pPr>
+        <w:rPr>
+          <w:lang w:val="es-ES" w:eastAsia="es-ES"/>
+        </w:rPr>
+      </w:pPr>
     </w:p>
     <w:p>
       <w:pPr>
@@ -2711,28 +2723,12 @@
         <w:color w:val="FF0000"/>
       </w:rPr>
     </w:pPr>
-    <w:proofErr w:type="spellStart"/>
     <w:r>
       <w:rPr>
         <w:color w:val="FF0000"/>
       </w:rPr>
-      <w:t>Product</w:t>
+      <w:t>Product vision</w:t>
     </w:r>
-    <w:proofErr w:type="spellEnd"/>
-    <w:r>
-      <w:rPr>
-        <w:color w:val="FF0000"/>
-      </w:rPr>
-      <w:t xml:space="preserve"> </w:t>
-    </w:r>
-    <w:proofErr w:type="spellStart"/>
-    <w:r>
-      <w:rPr>
-        <w:color w:val="FF0000"/>
-      </w:rPr>
-      <w:t>vision</w:t>
-    </w:r>
-    <w:proofErr w:type="spellEnd"/>
   </w:p>
   <w:p>
     <w:pPr>
@@ -5710,13 +5706,13 @@
   <w:rsids>
     <w:rsidRoot w:val="00960213"/>
     <w:rsid w:val="000609BA"/>
-    <w:rsid w:val="0007131A"/>
     <w:rsid w:val="00194DF5"/>
     <w:rsid w:val="001B14B7"/>
     <w:rsid w:val="00230D02"/>
     <w:rsid w:val="00252686"/>
     <w:rsid w:val="002835FC"/>
     <w:rsid w:val="002C06A7"/>
+    <w:rsid w:val="003874D5"/>
     <w:rsid w:val="004F7F49"/>
     <w:rsid w:val="0057410B"/>
     <w:rsid w:val="00595623"/>
@@ -5726,9 +5722,9 @@
     <w:rsid w:val="00704192"/>
     <w:rsid w:val="00825B36"/>
     <w:rsid w:val="009007E1"/>
+    <w:rsid w:val="00924B4B"/>
     <w:rsid w:val="00960213"/>
     <w:rsid w:val="009B18C0"/>
-    <w:rsid w:val="00AB605B"/>
     <w:rsid w:val="00BD2436"/>
     <w:rsid w:val="00C47BA2"/>
     <w:rsid w:val="00C5036F"/>
@@ -6478,7 +6474,7 @@
 
 <file path=customXml/item1.xml><?xml version="1.0" encoding="utf-8"?>
 <CoverPageProperties xmlns="http://schemas.microsoft.com/office/2006/coverPageProps">
-  <PublishDate>[Seleccionar fecha]</PublishDate>
+  <PublishDate/>
   <Abstract>Planificación y Especificación de Requisitos según estándares; IEEE 830, ISO9000 y PMI.</Abstract>
   <CompanyAddress/>
   <CompanyPhone/>

</xml_diff>